<commit_message>
docs(submission): 移除已停用的 OpenCode 组件表述
- 作品信息与原创性说明：第三方组件清单删除 OpenCode CLI 条目并重排编号；
  AI 工具清单与仓库证据不再列 OpenCode（该内嵌运行时随 Godot 版本移除，Flutter 版未使用）
- 作品介绍：AI 工具清单与第三方组件声明同步去掉 OpenCode
</commit_message>
<xml_diff>
--- a/submission/PIE-Block-作品介绍.docx
+++ b/submission/PIE-Block-作品介绍.docx
@@ -934,7 +934,7 @@
         <w:t>（4）开放与复用。</w:t>
       </w:r>
       <w:r>
-        <w:t>全部代码、文档与教材开源在 GitHub（github.com/louqingjie/PIE-Block），官网 pieblock.asia 提供在线体验与文档入口；SDCC C251 工具链、OpenCode CLI、字体与 Flutter 依赖等第三方组件均按许可证随包声明，便于其他学校或队伍参考与二次开发。</w:t>
+        <w:t>全部代码、文档与教材开源在 GitHub（github.com/louqingjie/PIE-Block），官网 pieblock.asia 提供在线体验与文档入口；SDCC C251 工具链、字体与 Flutter 依赖等第三方组件均按许可证随包声明，便于其他学校或队伍参考与二次开发。</w:t>
       </w:r>
     </w:p>
     <w:p>
@@ -954,7 +954,7 @@
         <w:t>（1）工具与模型。</w:t>
       </w:r>
       <w:r>
-        <w:t>作品开发全程使用 AI 编程工具辅助，包括 TRAE、OpenCode、WorkBuddy、DeepSeek Harness（DeepSeek 模型）、Qoder、CodeBuddy、Codex 与 Claude Code。不同工具承担不同角色：TRAE 保存了 5 份实施方案（分支迁移、Windows 安装器、代码页 C / 汇编对照视图等），OpenCode 通过 opencode.json 配置 Agent 的 bash / edit / webfetch 权限，WorkBuddy 以 .workbuddy/memory 记录长期协作约定与事故复盘，DeepSeek Harness 用于长链路任务与材料处理；其余工具用于实现、调试与重构。</w:t>
+        <w:t>作品开发全程使用 AI 编程工具辅助，包括 TRAE、WorkBuddy、DeepSeek Harness（DeepSeek 模型）、Qoder、CodeBuddy、Codex 与 Claude Code。不同工具承担不同角色：TRAE 保存了 5 份实施方案（分支迁移、Windows 安装器、代码页 C / 汇编对照视图等），WorkBuddy 以 .workbuddy/memory 记录长期协作约定与事故复盘，DeepSeek Harness 用于长链路任务与材料处理；其余工具用于实现、调试与重构。</w:t>
       </w:r>
     </w:p>
     <w:p>

</xml_diff>